<commit_message>
Add vendor self-registration with Thai address lookup, and record winner-announcement signing plus the procurement manual.
Co-authored-by: Cursor <cursoragent@cursor.com>
</commit_message>
<xml_diff>
--- a/odoo18-custom-addons/vpk_purchase_agreement_egp/static/src/templates/winner_announcement.docx
+++ b/odoo18-custom-addons/vpk_purchase_agreement_egp/static/src/templates/winner_announcement.docx
@@ -4,217 +4,129 @@
   <w:body>
     <w:p>
       <w:pPr>
-        <w:spacing w:before="0" w:after="280" w:line="240" w:lineRule="auto"/>
+        <w:spacing w:before="0" w:after="60" w:line="240" w:lineRule="auto"/>
+        <w:jc w:val="center"/>
+      </w:pPr>
+      <w:r>
+        <w:drawing>
+          <wp:inline xmlns:a="http://schemas.openxmlformats.org/drawingml/2006/main" xmlns:pic="http://schemas.openxmlformats.org/drawingml/2006/picture">
+            <wp:extent cx="979200" cy="1078780"/>
+            <wp:docPr id="1" name="Picture 1"/>
+            <wp:cNvGraphicFramePr>
+              <a:graphicFrameLocks noChangeAspect="1"/>
+            </wp:cNvGraphicFramePr>
+            <a:graphic>
+              <a:graphicData uri="http://schemas.openxmlformats.org/drawingml/2006/picture">
+                <pic:pic>
+                  <pic:nvPicPr>
+                    <pic:cNvPr id="0" name="garuda.jpeg"/>
+                    <pic:cNvPicPr/>
+                  </pic:nvPicPr>
+                  <pic:blipFill>
+                    <a:blip r:embed="rId9"/>
+                    <a:stretch>
+                      <a:fillRect/>
+                    </a:stretch>
+                  </pic:blipFill>
+                  <pic:spPr>
+                    <a:xfrm>
+                      <a:off x="0" y="0"/>
+                      <a:ext cx="979200" cy="1078780"/>
+                    </a:xfrm>
+                    <a:prstGeom prst="rect"/>
+                  </pic:spPr>
+                </pic:pic>
+              </a:graphicData>
+            </a:graphic>
+          </wp:inline>
+        </w:drawing>
+      </w:r>
+    </w:p>
+    <w:p>
+      <w:pPr>
+        <w:spacing w:before="0" w:after="0" w:line="240" w:lineRule="auto"/>
         <w:jc w:val="center"/>
       </w:pPr>
       <w:r>
         <w:rPr>
-          <w:rFonts w:ascii="TH Sarabun New" w:hAnsi="TH Sarabun New" w:eastAsia="TH Sarabun New" w:cs="TH Sarabun New"/>
+          <w:rFonts w:ascii="TH SarabunIT๙" w:hAnsi="TH SarabunIT๙" w:eastAsia="TH SarabunIT๙" w:cs="TH SarabunIT๙"/>
           <w:b/>
-          <w:sz w:val="44"/>
-        </w:rPr>
-        <w:t>( สำเนา )</w:t>
-      </w:r>
-    </w:p>
-    <w:p>
-      <w:pPr>
-        <w:spacing w:before="0" w:after="80" w:line="240" w:lineRule="auto"/>
-        <w:jc w:val="center"/>
-      </w:pPr>
-      <w:r>
-        <w:rPr>
-          <w:rFonts w:ascii="TH Sarabun New" w:hAnsi="TH Sarabun New" w:eastAsia="TH Sarabun New" w:cs="TH Sarabun New"/>
-          <w:b/>
-          <w:sz w:val="36"/>
+          <w:sz w:val="32"/>
         </w:rPr>
         <w:t>ประกาศ{{province}}</w:t>
       </w:r>
     </w:p>
     <w:p>
       <w:pPr>
-        <w:spacing w:before="0" w:after="40" w:line="240" w:lineRule="auto"/>
+        <w:spacing w:before="0" w:after="0" w:line="240" w:lineRule="auto"/>
         <w:jc w:val="center"/>
       </w:pPr>
       <w:r>
         <w:rPr>
-          <w:rFonts w:ascii="TH Sarabun New" w:hAnsi="TH Sarabun New" w:eastAsia="TH Sarabun New" w:cs="TH Sarabun New"/>
-          <w:b/>
+          <w:rFonts w:ascii="TH SarabunIT๙" w:hAnsi="TH SarabunIT๙" w:eastAsia="TH SarabunIT๙" w:cs="TH SarabunIT๙"/>
+          <w:b w:val="0"/>
           <w:sz w:val="32"/>
         </w:rPr>
-        <w:t>เรื่อง {{subject}}</w:t>
+        <w:t>เรื่อง  {{subject}}</w:t>
       </w:r>
     </w:p>
     <w:p>
       <w:pPr>
-        <w:spacing w:before="40" w:after="280" w:line="240" w:lineRule="auto"/>
+        <w:spacing w:before="0" w:after="0" w:line="240" w:lineRule="auto"/>
         <w:jc w:val="center"/>
       </w:pPr>
       <w:r>
         <w:rPr>
-          <w:rFonts w:ascii="TH Sarabun New" w:hAnsi="TH Sarabun New" w:eastAsia="TH Sarabun New" w:cs="TH Sarabun New"/>
+          <w:rFonts w:ascii="TH SarabunIT๙" w:hAnsi="TH SarabunIT๙" w:eastAsia="TH SarabunIT๙" w:cs="TH SarabunIT๙"/>
           <w:b w:val="0"/>
-          <w:sz w:val="28"/>
+          <w:sz w:val="32"/>
         </w:rPr>
-        <w:t>————————————————</w:t>
+        <w:t>---------------------------------------------------------------------</w:t>
       </w:r>
     </w:p>
     <w:p>
       <w:pPr>
-        <w:spacing w:before="80" w:after="400" w:line="240" w:lineRule="auto"/>
-        <w:ind w:firstLine="680"/>
-        <w:jc w:val="both"/>
+        <w:spacing w:before="120" w:after="0" w:line="240" w:lineRule="auto"/>
+        <w:ind w:firstLine="1417"/>
+        <w:jc w:val="thaiDistribute"/>
       </w:pPr>
       <w:r>
         <w:rPr>
-          <w:rFonts w:ascii="TH Sarabun New" w:hAnsi="TH Sarabun New" w:eastAsia="TH Sarabun New" w:cs="TH Sarabun New"/>
+          <w:rFonts w:ascii="TH SarabunIT๙" w:hAnsi="TH SarabunIT๙" w:eastAsia="TH SarabunIT๙" w:cs="TH SarabunIT๙"/>
           <w:b w:val="0"/>
           <w:sz w:val="32"/>
         </w:rPr>
-        <w:t>{{body}}</w:t>
+        <w:t>{{body_intro}}</w:t>
       </w:r>
     </w:p>
     <w:p>
       <w:pPr>
-        <w:spacing w:before="200" w:after="280" w:line="240" w:lineRule="auto"/>
-        <w:jc w:val="center"/>
+        <w:spacing w:before="120" w:after="0" w:line="240" w:lineRule="auto"/>
+        <w:ind w:firstLine="1417"/>
+        <w:jc w:val="thaiDistribute"/>
       </w:pPr>
       <w:r>
         <w:rPr>
-          <w:rFonts w:ascii="TH Sarabun New" w:hAnsi="TH Sarabun New" w:eastAsia="TH Sarabun New" w:cs="TH Sarabun New"/>
+          <w:rFonts w:ascii="TH SarabunIT๙" w:hAnsi="TH SarabunIT๙" w:eastAsia="TH SarabunIT๙" w:cs="TH SarabunIT๙"/>
           <w:b w:val="0"/>
           <w:sz w:val="32"/>
         </w:rPr>
-        <w:t>ประกาศ ณ วันที่ {{announce_date}}</w:t>
+        <w:t>{{body_winner}}</w:t>
       </w:r>
     </w:p>
     <w:p>
       <w:pPr>
-        <w:spacing w:before="0" w:after="40" w:line="240" w:lineRule="auto"/>
-        <w:ind w:left="1020"/>
-        <w:jc w:val="center"/>
+        <w:spacing w:before="240" w:after="0" w:line="240" w:lineRule="auto"/>
+        <w:ind w:firstLine="3543"/>
+        <w:jc w:val="thaiDistribute"/>
       </w:pPr>
       <w:r>
         <w:rPr>
-          <w:rFonts w:ascii="TH Sarabun New" w:hAnsi="TH Sarabun New" w:eastAsia="TH Sarabun New" w:cs="TH Sarabun New"/>
+          <w:rFonts w:ascii="TH SarabunIT๙" w:hAnsi="TH SarabunIT๙" w:eastAsia="TH SarabunIT๙" w:cs="TH SarabunIT๙"/>
           <w:b w:val="0"/>
           <w:sz w:val="32"/>
         </w:rPr>
-        <w:t>{{signer_name}}</w:t>
-      </w:r>
-    </w:p>
-    <w:p>
-      <w:pPr>
-        <w:spacing w:before="0" w:after="40" w:line="240" w:lineRule="auto"/>
-        <w:ind w:left="1020"/>
-        <w:jc w:val="center"/>
-      </w:pPr>
-      <w:r>
-        <w:rPr>
-          <w:rFonts w:ascii="TH Sarabun New" w:hAnsi="TH Sarabun New" w:eastAsia="TH Sarabun New" w:cs="TH Sarabun New"/>
-          <w:b w:val="0"/>
-          <w:sz w:val="32"/>
-        </w:rPr>
-        <w:t>({{signer_full}})</w:t>
-      </w:r>
-    </w:p>
-    <w:p>
-      <w:pPr>
-        <w:spacing w:before="0" w:after="40" w:line="240" w:lineRule="auto"/>
-        <w:ind w:left="1020"/>
-        <w:jc w:val="center"/>
-      </w:pPr>
-      <w:r>
-        <w:rPr>
-          <w:rFonts w:ascii="TH Sarabun New" w:hAnsi="TH Sarabun New" w:eastAsia="TH Sarabun New" w:cs="TH Sarabun New"/>
-          <w:b w:val="0"/>
-          <w:sz w:val="32"/>
-        </w:rPr>
-        <w:t>{{signer_title}}</w:t>
-      </w:r>
-    </w:p>
-    <w:p>
-      <w:pPr>
-        <w:spacing w:before="0" w:after="40" w:line="240" w:lineRule="auto"/>
-        <w:ind w:left="1020"/>
-        <w:jc w:val="center"/>
-      </w:pPr>
-      <w:r>
-        <w:rPr>
-          <w:rFonts w:ascii="TH Sarabun New" w:hAnsi="TH Sarabun New" w:eastAsia="TH Sarabun New" w:cs="TH Sarabun New"/>
-          <w:b w:val="0"/>
-          <w:sz w:val="32"/>
-        </w:rPr>
-        <w:t>{{signer_acting}}</w:t>
-      </w:r>
-    </w:p>
-    <w:p>
-      <w:pPr>
-        <w:spacing w:before="720" w:after="240" w:line="240" w:lineRule="auto"/>
-        <w:jc w:val="left"/>
-      </w:pPr>
-      <w:r>
-        <w:rPr>
-          <w:rFonts w:ascii="TH Sarabun New" w:hAnsi="TH Sarabun New" w:eastAsia="TH Sarabun New" w:cs="TH Sarabun New"/>
-          <w:b w:val="0"/>
-          <w:sz w:val="32"/>
-        </w:rPr>
-        <w:t>สำเนาถูกต้อง</w:t>
-      </w:r>
-    </w:p>
-    <w:p>
-      <w:pPr>
-        <w:spacing w:before="0" w:after="40" w:line="240" w:lineRule="auto"/>
-        <w:jc w:val="left"/>
-      </w:pPr>
-      <w:r>
-        <w:rPr>
-          <w:rFonts w:ascii="TH Sarabun New" w:hAnsi="TH Sarabun New" w:eastAsia="TH Sarabun New" w:cs="TH Sarabun New"/>
-          <w:b w:val="0"/>
-          <w:sz w:val="32"/>
-        </w:rPr>
-        <w:t>{{cert_name}}</w:t>
-      </w:r>
-    </w:p>
-    <w:p>
-      <w:pPr>
-        <w:spacing w:before="0" w:after="40" w:line="240" w:lineRule="auto"/>
-        <w:jc w:val="left"/>
-      </w:pPr>
-      <w:r>
-        <w:rPr>
-          <w:rFonts w:ascii="TH Sarabun New" w:hAnsi="TH Sarabun New" w:eastAsia="TH Sarabun New" w:cs="TH Sarabun New"/>
-          <w:b w:val="0"/>
-          <w:sz w:val="32"/>
-        </w:rPr>
-        <w:t>({{cert_full}})</w:t>
-      </w:r>
-    </w:p>
-    <w:p>
-      <w:pPr>
-        <w:spacing w:before="0" w:after="240" w:line="240" w:lineRule="auto"/>
-        <w:jc w:val="left"/>
-      </w:pPr>
-      <w:r>
-        <w:rPr>
-          <w:rFonts w:ascii="TH Sarabun New" w:hAnsi="TH Sarabun New" w:eastAsia="TH Sarabun New" w:cs="TH Sarabun New"/>
-          <w:b w:val="0"/>
-          <w:sz w:val="32"/>
-        </w:rPr>
-        <w:t>{{cert_title}}</w:t>
-      </w:r>
-    </w:p>
-    <w:p>
-      <w:pPr>
-        <w:spacing w:before="0" w:after="40" w:line="240" w:lineRule="auto"/>
-        <w:jc w:val="left"/>
-      </w:pPr>
-      <w:r>
-        <w:rPr>
-          <w:rFonts w:ascii="TH Sarabun New" w:hAnsi="TH Sarabun New" w:eastAsia="TH Sarabun New" w:cs="TH Sarabun New"/>
-          <w:b w:val="0"/>
-          <w:sz w:val="32"/>
-        </w:rPr>
-        <w:t>ประกาศขึ้นเว็บวันที่ {{web_date}}</w:t>
+        <w:t>ประกาศ  ณ  วันที่  {{announce_date}}</w:t>
       </w:r>
     </w:p>
     <w:p>
@@ -224,16 +136,86 @@
       </w:pPr>
       <w:r>
         <w:rPr>
-          <w:rFonts w:ascii="TH Sarabun New" w:hAnsi="TH Sarabun New" w:eastAsia="TH Sarabun New" w:cs="TH Sarabun New"/>
+          <w:rFonts w:ascii="TH SarabunIT๙" w:hAnsi="TH SarabunIT๙" w:eastAsia="TH SarabunIT๙" w:cs="TH SarabunIT๙"/>
           <w:b w:val="0"/>
           <w:sz w:val="32"/>
         </w:rPr>
-        <w:t>โดย {{web_by}}</w:t>
+      </w:r>
+    </w:p>
+    <w:p>
+      <w:pPr>
+        <w:spacing w:before="0" w:after="0" w:line="240" w:lineRule="auto"/>
+        <w:jc w:val="left"/>
+      </w:pPr>
+      <w:r>
+        <w:rPr>
+          <w:rFonts w:ascii="TH SarabunIT๙" w:hAnsi="TH SarabunIT๙" w:eastAsia="TH SarabunIT๙" w:cs="TH SarabunIT๙"/>
+          <w:b w:val="0"/>
+          <w:sz w:val="32"/>
+        </w:rPr>
+      </w:r>
+    </w:p>
+    <w:p>
+      <w:pPr>
+        <w:spacing w:before="0" w:after="0" w:line="240" w:lineRule="auto"/>
+        <w:jc w:val="left"/>
+      </w:pPr>
+      <w:r>
+        <w:rPr>
+          <w:rFonts w:ascii="TH SarabunIT๙" w:hAnsi="TH SarabunIT๙" w:eastAsia="TH SarabunIT๙" w:cs="TH SarabunIT๙"/>
+          <w:b w:val="0"/>
+          <w:sz w:val="32"/>
+        </w:rPr>
+      </w:r>
+    </w:p>
+    <w:p>
+      <w:pPr>
+        <w:spacing w:before="0" w:after="0" w:line="240" w:lineRule="auto"/>
+        <w:ind w:firstLine="4535"/>
+        <w:jc w:val="left"/>
+      </w:pPr>
+      <w:r>
+        <w:rPr>
+          <w:rFonts w:ascii="TH SarabunIT๙" w:hAnsi="TH SarabunIT๙" w:eastAsia="TH SarabunIT๙" w:cs="TH SarabunIT๙"/>
+          <w:b w:val="0"/>
+          <w:sz w:val="32"/>
+        </w:rPr>
+        <w:t>({{signer_full}})</w:t>
+      </w:r>
+    </w:p>
+    <w:p>
+      <w:pPr>
+        <w:spacing w:before="0" w:after="0" w:line="240" w:lineRule="auto"/>
+        <w:ind w:firstLine="4252"/>
+        <w:jc w:val="left"/>
+      </w:pPr>
+      <w:r>
+        <w:rPr>
+          <w:rFonts w:ascii="TH SarabunIT๙" w:hAnsi="TH SarabunIT๙" w:eastAsia="TH SarabunIT๙" w:cs="TH SarabunIT๙"/>
+          <w:b w:val="0"/>
+          <w:sz w:val="32"/>
+        </w:rPr>
+        <w:t>{{signer_title}}</w:t>
+      </w:r>
+    </w:p>
+    <w:p>
+      <w:pPr>
+        <w:spacing w:before="0" w:after="0" w:line="240" w:lineRule="auto"/>
+        <w:ind w:firstLine="3685"/>
+        <w:jc w:val="left"/>
+      </w:pPr>
+      <w:r>
+        <w:rPr>
+          <w:rFonts w:ascii="TH SarabunIT๙" w:hAnsi="TH SarabunIT๙" w:eastAsia="TH SarabunIT๙" w:cs="TH SarabunIT๙"/>
+          <w:b w:val="0"/>
+          <w:sz w:val="32"/>
+        </w:rPr>
+        <w:t>{{signer_acting}}</w:t>
       </w:r>
     </w:p>
     <w:sectPr>
       <w:pgSz w:w="11906" w:h="16838"/>
-      <w:pgMar w:top="1134" w:right="1134" w:bottom="1134" w:left="1701" w:header="720" w:footer="720" w:gutter="0"/>
+      <w:pgMar w:top="850" w:right="1134" w:bottom="1134" w:left="1701" w:header="720" w:footer="720" w:gutter="0"/>
       <w:cols w:space="720"/>
       <w:docGrid w:linePitch="360"/>
     </w:sectPr>
@@ -605,7 +587,7 @@
     <w:qFormat/>
     <w:rsid w:val="00FC693F"/>
     <w:rPr>
-      <w:rFonts w:ascii="TH Sarabun New" w:hAnsi="TH Sarabun New" w:eastAsia="TH Sarabun New" w:cs="TH Sarabun New"/>
+      <w:rFonts w:ascii="TH SarabunIT๙" w:hAnsi="TH SarabunIT๙" w:eastAsia="TH SarabunIT๙" w:cs="TH SarabunIT๙"/>
       <w:sz w:val="32"/>
     </w:rPr>
   </w:style>

</xml_diff>